<commit_message>
Integrate September 11 LOCAL release with preserved WEB state and reliable schedulers
</commit_message>
<xml_diff>
--- a/templates/nazk_supplier_request.docx
+++ b/templates/nazk_supplier_request.docx
@@ -136,39 +136,7 @@
           <w:sz w:val="20"/>
           <w:szCs w:val="20"/>
         </w:rPr>
-        <w:t xml:space="preserve">вул. </w:t>
-      </w:r>
-      <w:proofErr w:type="spellStart"/>
-      <w:r>
-        <w:rPr>
-          <w:sz w:val="20"/>
-          <w:szCs w:val="20"/>
-        </w:rPr>
-        <w:t>Бульварно-Кудрявська</w:t>
-      </w:r>
-      <w:proofErr w:type="spellEnd"/>
-      <w:r>
-        <w:rPr>
-          <w:sz w:val="20"/>
-          <w:szCs w:val="20"/>
-        </w:rPr>
-        <w:t xml:space="preserve">, 22, м. Київ, 01054, </w:t>
-      </w:r>
-      <w:proofErr w:type="spellStart"/>
-      <w:r>
-        <w:rPr>
-          <w:sz w:val="20"/>
-          <w:szCs w:val="20"/>
-        </w:rPr>
-        <w:t>тел</w:t>
-      </w:r>
-      <w:proofErr w:type="spellEnd"/>
-      <w:r>
-        <w:rPr>
-          <w:sz w:val="20"/>
-          <w:szCs w:val="20"/>
-        </w:rPr>
-        <w:t>.: (044) 578-04-80, (063) 578-04-80</w:t>
+        <w:t>вул. Бульварно-Кудрявська, 22, м. Київ, 01054, тел.: (044) 578-04-80, (063) 578-04-80</w:t>
       </w:r>
     </w:p>
     <w:p>
@@ -188,23 +156,7 @@
           <w:sz w:val="20"/>
           <w:szCs w:val="20"/>
         </w:rPr>
-        <w:t>E-</w:t>
-      </w:r>
-      <w:proofErr w:type="spellStart"/>
-      <w:r>
-        <w:rPr>
-          <w:sz w:val="20"/>
-          <w:szCs w:val="20"/>
-        </w:rPr>
-        <w:t>mail</w:t>
-      </w:r>
-      <w:proofErr w:type="spellEnd"/>
-      <w:r>
-        <w:rPr>
-          <w:sz w:val="20"/>
-          <w:szCs w:val="20"/>
-        </w:rPr>
-        <w:t>: info@profzakupivli.com, сайт: www.profzakupivli.com, код згідно ЄДРПОУ</w:t>
+        <w:t>E-mail: info@profzakupivli.com, сайт: www.profzakupivli.com, код згідно ЄДРПОУ</w:t>
       </w:r>
       <w:r>
         <w:rPr>
@@ -293,46 +245,14 @@
           <w:sz w:val="24"/>
           <w:szCs w:val="24"/>
         </w:rPr>
-        <w:t>{{</w:t>
-      </w:r>
-      <w:proofErr w:type="spellStart"/>
+        <w:t>{{supplier.code_label}}:</w:t>
+      </w:r>
       <w:r>
         <w:rPr>
           <w:sz w:val="24"/>
           <w:szCs w:val="24"/>
         </w:rPr>
-        <w:t>supplier.code_label</w:t>
-      </w:r>
-      <w:proofErr w:type="spellEnd"/>
-      <w:r>
-        <w:rPr>
-          <w:sz w:val="24"/>
-          <w:szCs w:val="24"/>
-        </w:rPr>
-        <w:t>}}:</w:t>
-      </w:r>
-      <w:r>
-        <w:rPr>
-          <w:sz w:val="24"/>
-          <w:szCs w:val="24"/>
-        </w:rPr>
-        <w:t xml:space="preserve"> {{</w:t>
-      </w:r>
-      <w:proofErr w:type="spellStart"/>
-      <w:r>
-        <w:rPr>
-          <w:sz w:val="24"/>
-          <w:szCs w:val="24"/>
-        </w:rPr>
-        <w:t>supplier.code</w:t>
-      </w:r>
-      <w:proofErr w:type="spellEnd"/>
-      <w:r>
-        <w:rPr>
-          <w:sz w:val="24"/>
-          <w:szCs w:val="24"/>
-        </w:rPr>
-        <w:t>}}</w:t>
+        <w:t xml:space="preserve"> {{supplier.code}}</w:t>
       </w:r>
       <w:r>
         <w:rPr>
@@ -360,46 +280,14 @@
           <w:sz w:val="25"/>
           <w:szCs w:val="25"/>
         </w:rPr>
-        <w:t>Е-</w:t>
-      </w:r>
-      <w:proofErr w:type="spellStart"/>
-      <w:r>
-        <w:rPr>
-          <w:sz w:val="25"/>
-          <w:szCs w:val="25"/>
-        </w:rPr>
-        <w:t>mail</w:t>
-      </w:r>
-      <w:proofErr w:type="spellEnd"/>
-      <w:r>
-        <w:rPr>
-          <w:sz w:val="25"/>
-          <w:szCs w:val="25"/>
-        </w:rPr>
-        <w:t>: </w:t>
+        <w:t>Е-mail: </w:t>
       </w:r>
       <w:r>
         <w:rPr>
           <w:sz w:val="24"/>
           <w:szCs w:val="24"/>
         </w:rPr>
-        <w:t>{{</w:t>
-      </w:r>
-      <w:proofErr w:type="spellStart"/>
-      <w:r>
-        <w:rPr>
-          <w:sz w:val="24"/>
-          <w:szCs w:val="24"/>
-        </w:rPr>
-        <w:t>supplier.email</w:t>
-      </w:r>
-      <w:proofErr w:type="spellEnd"/>
-      <w:r>
-        <w:rPr>
-          <w:sz w:val="24"/>
-          <w:szCs w:val="24"/>
-        </w:rPr>
-        <w:t>}}</w:t>
+        <w:t>{{supplier.email}}</w:t>
       </w:r>
     </w:p>
     <w:p>
@@ -502,23 +390,7 @@
           <w:sz w:val="26"/>
           <w:szCs w:val="26"/>
         </w:rPr>
-        <w:t xml:space="preserve">ДЕРЖАВНА УСТАНОВА «ПРОФЕСІЙНІ ЗАКУПІВЛІ» (далі – Установа) є адміністратором електронного каталогу Prozorro </w:t>
-      </w:r>
-      <w:proofErr w:type="spellStart"/>
-      <w:r>
-        <w:rPr>
-          <w:sz w:val="26"/>
-          <w:szCs w:val="26"/>
-        </w:rPr>
-        <w:t>Market</w:t>
-      </w:r>
-      <w:proofErr w:type="spellEnd"/>
-      <w:r>
-        <w:rPr>
-          <w:sz w:val="26"/>
-          <w:szCs w:val="26"/>
-        </w:rPr>
-        <w:t xml:space="preserve"> (далі – Адміністратор), порядок формування та використання якого визначено постановою Кабінету Міністрів України від 14.09.2020 № 822 «Про затвердження Порядку формування та використання електронного каталогу» (далі – Порядок № 822). Права та обов’язки адміністратора також врегульовано Порядком № 822.</w:t>
+        <w:t>ДЕРЖАВНА УСТАНОВА «ПРОФЕСІЙНІ ЗАКУПІВЛІ» (далі – Установа) є адміністратором електронного каталогу Prozorro Market (далі – Адміністратор), порядок формування та використання якого визначено постановою Кабінету Міністрів України від 14.09.2020 № 822 «Про затвердження Порядку формування та використання електронного каталогу» (далі – Порядок № 822). Права та обов’язки адміністратора також врегульовано Порядком № 822.</w:t>
       </w:r>
     </w:p>
     <w:p>
@@ -802,27 +674,7 @@
           <w:sz w:val="26"/>
           <w:szCs w:val="26"/>
         </w:rPr>
-        <w:t>«{{</w:t>
-      </w:r>
-      <w:proofErr w:type="spellStart"/>
-      <w:r>
-        <w:rPr>
-          <w:b/>
-          <w:bCs/>
-          <w:sz w:val="26"/>
-          <w:szCs w:val="26"/>
-        </w:rPr>
-        <w:t>manager.full_name</w:t>
-      </w:r>
-      <w:proofErr w:type="spellEnd"/>
-      <w:r>
-        <w:rPr>
-          <w:b/>
-          <w:bCs/>
-          <w:sz w:val="26"/>
-          <w:szCs w:val="26"/>
-        </w:rPr>
-        <w:t>}}»</w:t>
+        <w:t>«{{manager.full_name}}»</w:t>
       </w:r>
       <w:r>
         <w:rPr>
@@ -844,23 +696,7 @@
     </w:p>
     <w:p>
       <w:r>
-        <w:t xml:space="preserve">{{#if </w:t>
-      </w:r>
-      <w:proofErr w:type="spellStart"/>
-      <w:r>
-        <w:t>supplier.entity_type</w:t>
-      </w:r>
-      <w:proofErr w:type="spellEnd"/>
-      <w:r>
-        <w:t xml:space="preserve"> == "</w:t>
-      </w:r>
-      <w:proofErr w:type="spellStart"/>
-      <w:r>
-        <w:t>individual_entrepreneur</w:t>
-      </w:r>
-      <w:proofErr w:type="spellEnd"/>
-      <w:r>
-        <w:t>"}}</w:t>
+        <w:t>{{#if supplier.entity_type == "individual_entrepreneur"}}</w:t>
       </w:r>
     </w:p>
     <w:p>
@@ -914,23 +750,7 @@
           <w:sz w:val="26"/>
           <w:szCs w:val="26"/>
         </w:rPr>
-        <w:t>{{</w:t>
-      </w:r>
-      <w:proofErr w:type="spellStart"/>
-      <w:r>
-        <w:rPr>
-          <w:sz w:val="26"/>
-          <w:szCs w:val="26"/>
-        </w:rPr>
-        <w:t>manager.full_name_genitive</w:t>
-      </w:r>
-      <w:proofErr w:type="spellEnd"/>
-      <w:r>
-        <w:rPr>
-          <w:sz w:val="26"/>
-          <w:szCs w:val="26"/>
-        </w:rPr>
-        <w:t>}}</w:t>
+        <w:t>{{manager.full_name_genitive}}</w:t>
       </w:r>
       <w:r>
         <w:rPr>
@@ -944,23 +764,7 @@
           <w:sz w:val="26"/>
           <w:szCs w:val="26"/>
         </w:rPr>
-        <w:t>{{</w:t>
-      </w:r>
-      <w:proofErr w:type="spellStart"/>
-      <w:r>
-        <w:rPr>
-          <w:sz w:val="26"/>
-          <w:szCs w:val="26"/>
-        </w:rPr>
-        <w:t>manager.rnokpp</w:t>
-      </w:r>
-      <w:proofErr w:type="spellEnd"/>
-      <w:r>
-        <w:rPr>
-          <w:sz w:val="26"/>
-          <w:szCs w:val="26"/>
-        </w:rPr>
-        <w:t>}}</w:t>
+        <w:t>{{manager.rnokpp}}</w:t>
       </w:r>
       <w:r>
         <w:rPr>
@@ -1023,36 +827,12 @@
     </w:p>
     <w:p>
       <w:r>
-        <w:t>{{/</w:t>
-      </w:r>
-      <w:proofErr w:type="spellStart"/>
-      <w:r>
-        <w:t>if</w:t>
-      </w:r>
-      <w:proofErr w:type="spellEnd"/>
-      <w:r>
-        <w:t>}}</w:t>
-      </w:r>
-    </w:p>
-    <w:p>
-      <w:r>
-        <w:t xml:space="preserve">{{#if </w:t>
-      </w:r>
-      <w:proofErr w:type="spellStart"/>
-      <w:r>
-        <w:t>supplier.entity_type</w:t>
-      </w:r>
-      <w:proofErr w:type="spellEnd"/>
-      <w:r>
-        <w:t xml:space="preserve"> == "</w:t>
-      </w:r>
-      <w:proofErr w:type="spellStart"/>
-      <w:r>
-        <w:t>legal_entity</w:t>
-      </w:r>
-      <w:proofErr w:type="spellEnd"/>
-      <w:r>
-        <w:t>"}}</w:t>
+        <w:t>{{/if}}</w:t>
+      </w:r>
+    </w:p>
+    <w:p>
+      <w:r>
+        <w:t>{{#if supplier.entity_type == "legal_entity"}}</w:t>
       </w:r>
     </w:p>
     <w:p>
@@ -1113,115 +893,35 @@
           <w:sz w:val="26"/>
           <w:szCs w:val="26"/>
         </w:rPr>
-        <w:t>{{</w:t>
-      </w:r>
-      <w:proofErr w:type="spellStart"/>
-      <w:r>
-        <w:rPr>
-          <w:sz w:val="26"/>
-          <w:szCs w:val="26"/>
-        </w:rPr>
-        <w:t>supplier.name_genitive</w:t>
-      </w:r>
-      <w:proofErr w:type="spellEnd"/>
-      <w:r>
-        <w:rPr>
-          <w:sz w:val="26"/>
-          <w:szCs w:val="26"/>
-        </w:rPr>
-        <w:t>}}</w:t>
-      </w:r>
-      <w:r>
-        <w:rPr>
-          <w:sz w:val="26"/>
-          <w:szCs w:val="26"/>
-        </w:rPr>
-        <w:t xml:space="preserve"> ({{</w:t>
-      </w:r>
-      <w:proofErr w:type="spellStart"/>
-      <w:r>
-        <w:rPr>
-          <w:sz w:val="26"/>
-          <w:szCs w:val="26"/>
-        </w:rPr>
-        <w:t>supplier.code_label</w:t>
-      </w:r>
-      <w:proofErr w:type="spellEnd"/>
-      <w:r>
-        <w:rPr>
-          <w:sz w:val="26"/>
-          <w:szCs w:val="26"/>
-        </w:rPr>
-        <w:t>}}: {{</w:t>
-      </w:r>
-      <w:proofErr w:type="spellStart"/>
-      <w:r>
-        <w:rPr>
-          <w:sz w:val="26"/>
-          <w:szCs w:val="26"/>
-        </w:rPr>
-        <w:t>supplier.code</w:t>
-      </w:r>
-      <w:proofErr w:type="spellEnd"/>
-      <w:r>
-        <w:rPr>
-          <w:sz w:val="26"/>
-          <w:szCs w:val="26"/>
-        </w:rPr>
-        <w:t>}}) {{</w:t>
-      </w:r>
-      <w:proofErr w:type="spellStart"/>
-      <w:r>
-        <w:rPr>
-          <w:sz w:val="26"/>
-          <w:szCs w:val="26"/>
-        </w:rPr>
-        <w:t>manager.full_name_genitive</w:t>
-      </w:r>
-      <w:proofErr w:type="spellEnd"/>
-      <w:r>
-        <w:rPr>
-          <w:sz w:val="26"/>
-          <w:szCs w:val="26"/>
-        </w:rPr>
-        <w:t>}}</w:t>
-      </w:r>
-      <w:r>
-        <w:rPr>
-          <w:sz w:val="26"/>
-          <w:szCs w:val="26"/>
-        </w:rPr>
-        <w:t xml:space="preserve"> </w:t>
-      </w:r>
-      <w:r>
-        <w:rPr>
-          <w:sz w:val="26"/>
-          <w:szCs w:val="26"/>
-        </w:rPr>
-        <w:t xml:space="preserve">(РНОКПП: </w:t>
-      </w:r>
-      <w:r>
-        <w:rPr>
-          <w:sz w:val="26"/>
-          <w:szCs w:val="26"/>
-        </w:rPr>
-        <w:t>{{</w:t>
-      </w:r>
-      <w:proofErr w:type="spellStart"/>
-      <w:r>
-        <w:rPr>
-          <w:sz w:val="26"/>
-          <w:szCs w:val="26"/>
-        </w:rPr>
-        <w:t>manager.rnokpp</w:t>
-      </w:r>
-      <w:proofErr w:type="spellEnd"/>
-      <w:r>
-        <w:rPr>
-          <w:sz w:val="26"/>
-          <w:szCs w:val="26"/>
-        </w:rPr>
-        <w:t>}}</w:t>
+        <w:t>{{supplier.name_genitive}}</w:t>
+      </w:r>
+      <w:r>
+        <w:rPr>
+          <w:sz w:val="26"/>
+          <w:szCs w:val="26"/>
+        </w:rPr>
+        <w:t xml:space="preserve"> ({{supplier.code_label}}: {{supplier.code}}) {{manager.full_name_genitive}}</w:t>
+      </w:r>
+      <w:r>
+        <w:rPr>
+          <w:sz w:val="26"/>
+          <w:szCs w:val="26"/>
+        </w:rPr>
+        <w:t xml:space="preserve"> (РНОКПП: </w:t>
+      </w:r>
+      <w:r>
+        <w:rPr>
+          <w:sz w:val="26"/>
+          <w:szCs w:val="26"/>
+        </w:rPr>
+        <w:t>{{manager.rnokpp}}</w:t>
+      </w:r>
+      <w:r>
+        <w:rPr>
+          <w:sz w:val="26"/>
+          <w:szCs w:val="26"/>
+        </w:rPr>
+        <w:t>)</w:t>
       </w:r>
       <w:r>
         <w:rPr>
@@ -1280,15 +980,7 @@
     </w:p>
     <w:p>
       <w:r>
-        <w:t>{{/</w:t>
-      </w:r>
-      <w:proofErr w:type="spellStart"/>
-      <w:r>
-        <w:t>if</w:t>
-      </w:r>
-      <w:proofErr w:type="spellEnd"/>
-      <w:r>
-        <w:t>}}</w:t>
+        <w:t>{{/if}}</w:t>
       </w:r>
     </w:p>
     <w:p>
@@ -1307,23 +999,7 @@
           <w:sz w:val="26"/>
           <w:szCs w:val="26"/>
         </w:rPr>
-        <w:t>Звертаємо увагу на те, що у разі ненадання запитуваної довідки, аналіз результатів перевірки та прийняття рішення за її наслідками (</w:t>
-      </w:r>
-      <w:proofErr w:type="spellStart"/>
-      <w:r>
-        <w:rPr>
-          <w:sz w:val="26"/>
-          <w:szCs w:val="26"/>
-        </w:rPr>
-        <w:t>п.п</w:t>
-      </w:r>
-      <w:proofErr w:type="spellEnd"/>
-      <w:r>
-        <w:rPr>
-          <w:sz w:val="26"/>
-          <w:szCs w:val="26"/>
-        </w:rPr>
-        <w:t>. 38, 40, 44 Порядку № 822) здійснюватиметься відповідно до інформації, що наявна в Реєстрі.</w:t>
+        <w:t>Звертаємо увагу на те, що у разі ненадання запитуваної довідки, аналіз результатів перевірки та прийняття рішення за її наслідками (п.п. 38, 40, 44 Порядку № 822) здійснюватиметься відповідно до інформації, що наявна в Реєстрі.</w:t>
       </w:r>
     </w:p>
     <w:p>

</xml_diff>